<commit_message>
feat(rom): add the m_qnsc_wrap_rom wrapper, generated with emacs verilog-mode
- rtl/emacs/m_qnsc_wrap_rom.src.sv: wrapper source; rtl/m_qnsc_wrap_rom.sv is
  what make wrap BLOCK=rom writes. The vendored AXI4-SRAM controller keeps its
  write channel tied idle (MAS Table 10-1); its memory port reads the
  generated image; AW/W/B go to the write-error responder.
- rtl/m_qnsc_rom_wr_resp.sv: the responder (MAS 7.3), a hand-written FSM
  whose ports carry the wrapper's names, so AUTOINST connects it by name.
- util/gen_rom.py and util/gen/rom/: the image as a constant case module
  (MAS 7.2), generated from rom_image.hex; --check regenerates and compares.
- design/rom/boot/: the bootloader source that builds rom_image.hex
  (QNSC_BOOT_SPEC V3.0), with its protocol model and tests.
- QNSC_ROM_MAS V3.2: the responder is named as its own module inside the
  wrapper; the docx is rebuilt.

Co-Authored-By: Claude Opus 5.5 (1M context) <noreply@anthropic.com>
</commit_message>
<xml_diff>
--- a/doc/specs/docx/QNSC_ROM_MAS.docx
+++ b/doc/specs/docx/QNSC_ROM_MAS.docx
@@ -15,7 +15,25 @@
         <w:pStyle w:val="Subtitle"/>
       </w:pPr>
       <w:r>
-        <w:t xml:space="preserve">MICRO-ARCHITECTURE SPECIFICATION – V3.1</w:t>
+        <w:t xml:space="preserve">MICRO-ARCHITECTURE</w:t>
+      </w:r>
+      <w:r>
+        <w:t xml:space="preserve"> </w:t>
+      </w:r>
+      <w:r>
+        <w:t xml:space="preserve">SPECIFICATION</w:t>
+      </w:r>
+      <w:r>
+        <w:t xml:space="preserve"> </w:t>
+      </w:r>
+      <w:r>
+        <w:t xml:space="preserve">–</w:t>
+      </w:r>
+      <w:r>
+        <w:t xml:space="preserve"> </w:t>
+      </w:r>
+      <w:r>
+        <w:t xml:space="preserve">V3.2</w:t>
       </w:r>
     </w:p>
     <w:p>
@@ -23,7 +41,31 @@
         <w:pStyle w:val="Author"/>
       </w:pPr>
       <w:r>
-        <w:t xml:space="preserve">QUY NHON SEMICONDUCTORS – QNSC</w:t>
+        <w:t xml:space="preserve">QUY</w:t>
+      </w:r>
+      <w:r>
+        <w:t xml:space="preserve"> </w:t>
+      </w:r>
+      <w:r>
+        <w:t xml:space="preserve">NHON</w:t>
+      </w:r>
+      <w:r>
+        <w:t xml:space="preserve"> </w:t>
+      </w:r>
+      <w:r>
+        <w:t xml:space="preserve">SEMICONDUCTORS</w:t>
+      </w:r>
+      <w:r>
+        <w:t xml:space="preserve"> </w:t>
+      </w:r>
+      <w:r>
+        <w:t xml:space="preserve">–</w:t>
+      </w:r>
+      <w:r>
+        <w:t xml:space="preserve"> </w:t>
+      </w:r>
+      <w:r>
+        <w:t xml:space="preserve">QNSC</w:t>
       </w:r>
     </w:p>
     <w:p>
@@ -258,7 +300,7 @@
         </w:p>
       </w:sdtContent>
     </w:sdt>
-    <w:bookmarkStart w:id="26" w:name="revision-history"/>
+    <w:bookmarkStart w:id="21" w:name="revision-history"/>
     <w:p>
       <w:pPr>
         <w:pStyle w:val="Heading1"/>
@@ -277,7 +319,7 @@
       <w:r>
         <w:t xml:space="preserve"> </w:t>
       </w:r>
-      <w:hyperlink r:id="rId25">
+      <w:hyperlink r:id="rId20">
         <w:r>
           <w:rPr>
             <w:rStyle w:val="VerbatimChar"/>
@@ -293,8 +335,8 @@
       <w:tblPr>
         <w:tblStyle w:val="TableGrid"/>
         <w:tblW w:type="pct" w:w="5000"/>
-        <w:tblLayout w:type="fixed"/>
         <w:tblLook w:firstRow="1" w:lastRow="0" w:firstColumn="0" w:lastColumn="0" w:noHBand="0" w:noVBand="0" w:val="0020"/>
+        <w:jc w:val="start"/>
       </w:tblPr>
       <w:tblGrid>
         <w:gridCol w:w="1584"/>
@@ -305,7 +347,7 @@
       </w:tblGrid>
       <w:tr>
         <w:trPr>
-          <w:tblHeader w:val="on"/>
+          <w:tblHeader w:val="true"/>
         </w:trPr>
         <w:tc>
           <w:tcPr/>
@@ -531,9 +573,83 @@
           </w:p>
         </w:tc>
       </w:tr>
+      <w:tr>
+        <w:tc>
+          <w:tcPr/>
+          <w:p>
+            <w:pPr>
+              <w:pStyle w:val="Compact"/>
+              <w:jc w:val="left"/>
+            </w:pPr>
+            <w:r>
+              <w:t xml:space="preserve">V3.2</w:t>
+            </w:r>
+          </w:p>
+        </w:tc>
+        <w:tc>
+          <w:tcPr/>
+          <w:p>
+            <w:pPr>
+              <w:pStyle w:val="Compact"/>
+              <w:jc w:val="left"/>
+            </w:pPr>
+            <w:r>
+              <w:t xml:space="preserve">2026-09-29</w:t>
+            </w:r>
+          </w:p>
+        </w:tc>
+        <w:tc>
+          <w:tcPr/>
+          <w:p>
+            <w:pPr>
+              <w:pStyle w:val="Compact"/>
+              <w:jc w:val="left"/>
+            </w:pPr>
+            <w:r>
+              <w:t xml:space="preserve">Nguyen Hao Nam</w:t>
+            </w:r>
+          </w:p>
+        </w:tc>
+        <w:tc>
+          <w:tcPr/>
+          <w:p>
+            <w:pPr>
+              <w:pStyle w:val="Compact"/>
+              <w:jc w:val="left"/>
+            </w:pPr>
+            <w:r>
+              <w:t xml:space="preserve">–</w:t>
+            </w:r>
+          </w:p>
+        </w:tc>
+        <w:tc>
+          <w:tcPr/>
+          <w:p>
+            <w:pPr>
+              <w:pStyle w:val="Compact"/>
+              <w:jc w:val="left"/>
+            </w:pPr>
+            <w:r>
+              <w:t xml:space="preserve">Sections 3, 5, 7.3: the write-error responder is the module</w:t>
+            </w:r>
+            <w:r>
+              <w:t xml:space="preserve"> </w:t>
+            </w:r>
+            <w:r>
+              <w:rPr>
+                <w:rStyle w:val="VerbatimChar"/>
+              </w:rPr>
+              <w:t xml:space="preserve">m_qnsc_rom_wr_resp</w:t>
+            </w:r>
+            <w:r>
+              <w:t xml:space="preserve">, instantiated in the wrapper, so the wrapper is generated with emacs verilog-mode</w:t>
+            </w:r>
+          </w:p>
+        </w:tc>
+      </w:tr>
     </w:tbl>
-    <w:bookmarkEnd w:id="26"/>
-    <w:bookmarkStart w:id="27" w:name="overview"/>
+    <w:bookmarkEnd w:id="21"/>
+    <w:bookmarkStart w:id="22" w:name="overview"/>
     <w:p>
       <w:pPr>
         <w:pStyle w:val="Heading1"/>
@@ -610,8 +726,8 @@
       </w:r>
       <w:r>
         <w:rPr>
+          <w:bCs/>
           <w:b/>
-          <w:bCs/>
         </w:rPr>
         <w:t xml:space="preserve">no mask ROM and no OTP</w:t>
       </w:r>
@@ -689,8 +805,8 @@
         <w:t xml:space="preserve">, owner Nguyen Hao Nam.</w:t>
       </w:r>
     </w:p>
-    <w:bookmarkEnd w:id="27"/>
-    <w:bookmarkStart w:id="28" w:name="features"/>
+    <w:bookmarkEnd w:id="22"/>
+    <w:bookmarkStart w:id="23" w:name="features"/>
     <w:p>
       <w:pPr>
         <w:pStyle w:val="Heading1"/>
@@ -701,11 +817,11 @@
     </w:p>
     <w:p>
       <w:pPr>
-        <w:pStyle w:val="Compact"/>
         <w:numPr>
           <w:ilvl w:val="0"/>
           <w:numId w:val="1001"/>
         </w:numPr>
+        <w:pStyle w:val="Compact"/>
         <w:jc w:val="left"/>
       </w:pPr>
       <w:r>
@@ -738,11 +854,11 @@
     </w:p>
     <w:p>
       <w:pPr>
-        <w:pStyle w:val="Compact"/>
         <w:numPr>
           <w:ilvl w:val="0"/>
           <w:numId w:val="1001"/>
         </w:numPr>
+        <w:pStyle w:val="Compact"/>
         <w:jc w:val="left"/>
       </w:pPr>
       <w:r>
@@ -751,11 +867,11 @@
     </w:p>
     <w:p>
       <w:pPr>
-        <w:pStyle w:val="Compact"/>
         <w:numPr>
           <w:ilvl w:val="0"/>
           <w:numId w:val="1001"/>
         </w:numPr>
+        <w:pStyle w:val="Compact"/>
         <w:jc w:val="left"/>
       </w:pPr>
       <w:r>
@@ -764,11 +880,11 @@
     </w:p>
     <w:p>
       <w:pPr>
-        <w:pStyle w:val="Compact"/>
         <w:numPr>
           <w:ilvl w:val="0"/>
           <w:numId w:val="1001"/>
         </w:numPr>
+        <w:pStyle w:val="Compact"/>
         <w:jc w:val="left"/>
       </w:pPr>
       <w:r>
@@ -789,11 +905,11 @@
     </w:p>
     <w:p>
       <w:pPr>
-        <w:pStyle w:val="Compact"/>
         <w:numPr>
           <w:ilvl w:val="0"/>
           <w:numId w:val="1001"/>
         </w:numPr>
+        <w:pStyle w:val="Compact"/>
         <w:jc w:val="left"/>
       </w:pPr>
       <w:r>
@@ -815,8 +931,8 @@
         <w:t xml:space="preserve">– 6.</w:t>
       </w:r>
     </w:p>
-    <w:bookmarkEnd w:id="28"/>
-    <w:bookmarkStart w:id="32" w:name="block-diagram"/>
+    <w:bookmarkEnd w:id="23"/>
+    <w:bookmarkStart w:id="27" w:name="block-diagram"/>
     <w:p>
       <w:pPr>
         <w:pStyle w:val="Heading1"/>
@@ -835,18 +951,18 @@
           <wp:inline>
             <wp:extent cx="5727700" cy="2428774"/>
             <wp:effectExtent b="0" l="0" r="0" t="0"/>
-            <wp:docPr descr="ROM wrapper, read and write paths" title="" id="30" name="Picture"/>
+            <wp:docPr descr="ROM wrapper, read and write paths" title="" id="25" name="Picture"/>
             <a:graphic>
               <a:graphicData uri="http://schemas.openxmlformats.org/drawingml/2006/picture">
                 <pic:pic>
                   <pic:nvPicPr>
-                    <pic:cNvPr descr="../figures/img/fig_rom_block.png" id="31" name="Picture"/>
+                    <pic:cNvPr descr="../figures/img/fig_rom_block.png" id="26" name="Picture"/>
                     <pic:cNvPicPr>
                       <a:picLocks noChangeArrowheads="1" noChangeAspect="1"/>
                     </pic:cNvPicPr>
                   </pic:nvPicPr>
                   <pic:blipFill>
-                    <a:blip r:embed="rId29"/>
+                    <a:blip r:embed="rId24"/>
                     <a:stretch>
                       <a:fillRect/>
                     </a:stretch>
@@ -894,8 +1010,8 @@
       <w:tblPr>
         <w:tblStyle w:val="TableGrid"/>
         <w:tblW w:type="pct" w:w="5000"/>
-        <w:tblLayout w:type="fixed"/>
         <w:tblLook w:firstRow="1" w:lastRow="0" w:firstColumn="0" w:lastColumn="0" w:noHBand="0" w:noVBand="0" w:val="0020"/>
+        <w:jc w:val="start"/>
         <w:tblCaption w:val="Sub-blocks"/>
       </w:tblPr>
       <w:tblGrid>
@@ -905,7 +1021,7 @@
       </w:tblGrid>
       <w:tr>
         <w:trPr>
-          <w:tblHeader w:val="on"/>
+          <w:tblHeader w:val="true"/>
         </w:trPr>
         <w:tc>
           <w:tcPr/>
@@ -1053,7 +1169,13 @@
               <w:jc w:val="left"/>
             </w:pPr>
             <w:r>
-              <w:t xml:space="preserve">in</w:t>
+              <w:rPr>
+                <w:rStyle w:val="VerbatimChar"/>
+              </w:rPr>
+              <w:t xml:space="preserve">m_qnsc_rom_wr_resp</w:t>
+            </w:r>
+            <w:r>
+              <w:t xml:space="preserve">, in</w:t>
             </w:r>
             <w:r>
               <w:t xml:space="preserve"> </w:t>
@@ -1094,6 +1216,38 @@
         <w:pStyle w:val="BodyText"/>
       </w:pPr>
       <w:r>
+        <w:rPr>
+          <w:rStyle w:val="VerbatimChar"/>
+        </w:rPr>
+        <w:t xml:space="preserve">m_qnsc_wrap_rom</w:t>
+      </w:r>
+      <w:r>
+        <w:t xml:space="preserve"> </w:t>
+      </w:r>
+      <w:r>
+        <w:t xml:space="preserve">only instantiates the three and is generated with emacs</w:t>
+      </w:r>
+      <w:r>
+        <w:t xml:space="preserve"> </w:t>
+      </w:r>
+      <w:r>
+        <w:t xml:space="preserve">verilog-mode (</w:t>
+      </w:r>
+      <w:r>
+        <w:rPr>
+          <w:rStyle w:val="VerbatimChar"/>
+        </w:rPr>
+        <w:t xml:space="preserve">doc/guides/EMACS_AUTO.md</w:t>
+      </w:r>
+      <w:r>
+        <w:t xml:space="preserve">); the responder is hand-written logic.</w:t>
+      </w:r>
+    </w:p>
+    <w:p>
+      <w:pPr>
+        <w:pStyle w:val="BodyText"/>
+      </w:pPr>
+      <w:r>
         <w:t xml:space="preserve">The controller is the one</w:t>
       </w:r>
       <w:r>
@@ -1163,8 +1317,8 @@
         <w:t xml:space="preserve">clock cluster: clock never gated.</w:t>
       </w:r>
     </w:p>
-    <w:bookmarkEnd w:id="32"/>
-    <w:bookmarkStart w:id="33" w:name="ip-used"/>
+    <w:bookmarkEnd w:id="27"/>
+    <w:bookmarkStart w:id="28" w:name="ip-used"/>
     <w:p>
       <w:pPr>
         <w:pStyle w:val="Heading1"/>
@@ -1185,8 +1339,8 @@
       <w:tblPr>
         <w:tblStyle w:val="TableGrid"/>
         <w:tblW w:type="pct" w:w="5000"/>
-        <w:tblLayout w:type="fixed"/>
         <w:tblLook w:firstRow="1" w:lastRow="0" w:firstColumn="0" w:lastColumn="0" w:noHBand="0" w:noVBand="0" w:val="0020"/>
+        <w:jc w:val="start"/>
         <w:tblCaption w:val="Upstream IP used"/>
       </w:tblPr>
       <w:tblGrid>
@@ -1197,7 +1351,7 @@
       </w:tblGrid>
       <w:tr>
         <w:trPr>
-          <w:tblHeader w:val="on"/>
+          <w:tblHeader w:val="true"/>
         </w:trPr>
         <w:tc>
           <w:tcPr/>
@@ -1397,8 +1551,8 @@
         <w:t xml:space="preserve">, every beat is a full word.</w:t>
       </w:r>
     </w:p>
-    <w:bookmarkEnd w:id="33"/>
-    <w:bookmarkStart w:id="34" w:name="interface"/>
+    <w:bookmarkEnd w:id="28"/>
+    <w:bookmarkStart w:id="29" w:name="interface"/>
     <w:p>
       <w:pPr>
         <w:pStyle w:val="Heading1"/>
@@ -1428,8 +1582,8 @@
       <w:tblPr>
         <w:tblStyle w:val="TableGrid"/>
         <w:tblW w:type="pct" w:w="5000"/>
-        <w:tblLayout w:type="fixed"/>
         <w:tblLook w:firstRow="1" w:lastRow="0" w:firstColumn="0" w:lastColumn="0" w:noHBand="0" w:noVBand="0" w:val="0020"/>
+        <w:jc w:val="start"/>
         <w:tblCaption w:val="m_qnsc_wrap_rom interface"/>
       </w:tblPr>
       <w:tblGrid>
@@ -1440,7 +1594,7 @@
       </w:tblGrid>
       <w:tr>
         <w:trPr>
-          <w:tblHeader w:val="on"/>
+          <w:tblHeader w:val="true"/>
         </w:trPr>
         <w:tc>
           <w:tcPr/>
@@ -1747,7 +1901,55 @@
               <w:jc w:val="left"/>
             </w:pPr>
             <w:r>
-              <w:t xml:space="preserve">To the responder.</w:t>
+              <w:t xml:space="preserve">To the responder</w:t>
+            </w:r>
+            <w:r>
+              <w:t xml:space="preserve"> </w:t>
+            </w:r>
+            <w:r>
+              <w:rPr>
+                <w:rStyle w:val="VerbatimChar"/>
+              </w:rPr>
+              <w:t xml:space="preserve">m_qnsc_rom_wr_resp</w:t>
+            </w:r>
+            <w:r>
+              <w:t xml:space="preserve">, whose ports carry the same names.</w:t>
+            </w:r>
+            <w:r>
+              <w:t xml:space="preserve"> </w:t>
+            </w:r>
+            <w:r>
+              <w:rPr>
+                <w:rStyle w:val="VerbatimChar"/>
+              </w:rPr>
+              <w:t xml:space="preserve">aw_addr</w:t>
+            </w:r>
+            <w:r>
+              <w:t xml:space="preserve">,</w:t>
+            </w:r>
+            <w:r>
+              <w:t xml:space="preserve"> </w:t>
+            </w:r>
+            <w:r>
+              <w:rPr>
+                <w:rStyle w:val="VerbatimChar"/>
+              </w:rPr>
+              <w:t xml:space="preserve">aw_burst</w:t>
+            </w:r>
+            <w:r>
+              <w:t xml:space="preserve">,</w:t>
+            </w:r>
+            <w:r>
+              <w:t xml:space="preserve"> </w:t>
+            </w:r>
+            <w:r>
+              <w:rPr>
+                <w:rStyle w:val="VerbatimChar"/>
+              </w:rPr>
+              <w:t xml:space="preserve">aw_len</w:t>
+            </w:r>
+            <w:r>
+              <w:t xml:space="preserve">,</w:t>
             </w:r>
             <w:r>
               <w:t xml:space="preserve"> </w:t>
@@ -1863,8 +2065,8 @@
       <w:tblPr>
         <w:tblStyle w:val="TableGrid"/>
         <w:tblW w:type="pct" w:w="5000"/>
-        <w:tblLayout w:type="fixed"/>
         <w:tblLook w:firstRow="1" w:lastRow="0" w:firstColumn="0" w:lastColumn="0" w:noHBand="0" w:noVBand="0" w:val="0020"/>
+        <w:jc w:val="start"/>
         <w:tblCaption w:val="m_qnsc_rom_image interface"/>
       </w:tblPr>
       <w:tblGrid>
@@ -1875,7 +2077,7 @@
       </w:tblGrid>
       <w:tr>
         <w:trPr>
-          <w:tblHeader w:val="on"/>
+          <w:tblHeader w:val="true"/>
         </w:trPr>
         <w:tc>
           <w:tcPr/>
@@ -2198,6 +2400,7 @@
         <w:tblStyle w:val="TableGrid"/>
         <w:tblW w:type="auto" w:w="0"/>
         <w:tblLook w:firstRow="1" w:lastRow="0" w:firstColumn="0" w:lastColumn="0" w:noHBand="0" w:noVBand="0" w:val="0020"/>
+        <w:jc w:val="start"/>
         <w:tblCaption w:val="Controller parameters"/>
       </w:tblPr>
       <w:tblGrid>
@@ -2206,7 +2409,7 @@
       </w:tblGrid>
       <w:tr>
         <w:trPr>
-          <w:tblHeader w:val="on"/>
+          <w:tblHeader w:val="true"/>
         </w:trPr>
         <w:tc>
           <w:tcPr/>
@@ -2369,8 +2572,8 @@
         </w:tc>
       </w:tr>
     </w:tbl>
-    <w:bookmarkEnd w:id="34"/>
-    <w:bookmarkStart w:id="38" w:name="address-map-and-layout"/>
+    <w:bookmarkEnd w:id="29"/>
+    <w:bookmarkStart w:id="33" w:name="address-map-and-layout"/>
     <w:p>
       <w:pPr>
         <w:pStyle w:val="Heading1"/>
@@ -2391,8 +2594,8 @@
       <w:tblPr>
         <w:tblStyle w:val="TableGrid"/>
         <w:tblW w:type="pct" w:w="5000"/>
-        <w:tblLayout w:type="fixed"/>
         <w:tblLook w:firstRow="1" w:lastRow="0" w:firstColumn="0" w:lastColumn="0" w:noHBand="0" w:noVBand="0" w:val="0020"/>
+        <w:jc w:val="start"/>
         <w:tblCaption w:val="Memory map, regions behind AXI_M0"/>
       </w:tblPr>
       <w:tblGrid>
@@ -2405,7 +2608,7 @@
       </w:tblGrid>
       <w:tr>
         <w:trPr>
-          <w:tblHeader w:val="on"/>
+          <w:tblHeader w:val="true"/>
         </w:trPr>
         <w:tc>
           <w:tcPr/>
@@ -2571,18 +2774,18 @@
           <wp:inline>
             <wp:extent cx="4206240" cy="2025747"/>
             <wp:effectExtent b="0" l="0" r="0" t="0"/>
-            <wp:docPr descr="ROM layout" title="" id="36" name="Picture"/>
+            <wp:docPr descr="ROM layout" title="" id="31" name="Picture"/>
             <a:graphic>
               <a:graphicData uri="http://schemas.openxmlformats.org/drawingml/2006/picture">
                 <pic:pic>
                   <pic:nvPicPr>
-                    <pic:cNvPr descr="../figures/img/fig_rom_layout.png" id="37" name="Picture"/>
+                    <pic:cNvPr descr="../figures/img/fig_rom_layout.png" id="32" name="Picture"/>
                     <pic:cNvPicPr>
                       <a:picLocks noChangeArrowheads="1" noChangeAspect="1"/>
                     </pic:cNvPicPr>
                   </pic:nvPicPr>
                   <pic:blipFill>
-                    <a:blip r:embed="rId35"/>
+                    <a:blip r:embed="rId30"/>
                     <a:stretch>
                       <a:fillRect/>
                     </a:stretch>
@@ -2630,8 +2833,8 @@
       <w:tblPr>
         <w:tblStyle w:val="TableGrid"/>
         <w:tblW w:type="pct" w:w="5000"/>
-        <w:tblLayout w:type="fixed"/>
         <w:tblLook w:firstRow="1" w:lastRow="0" w:firstColumn="0" w:lastColumn="0" w:noHBand="0" w:noVBand="0" w:val="0020"/>
+        <w:jc w:val="start"/>
         <w:tblCaption w:val="ROM layout"/>
       </w:tblPr>
       <w:tblGrid>
@@ -2642,7 +2845,7 @@
       </w:tblGrid>
       <w:tr>
         <w:trPr>
-          <w:tblHeader w:val="on"/>
+          <w:tblHeader w:val="true"/>
         </w:trPr>
         <w:tc>
           <w:tcPr/>
@@ -2925,8 +3128,8 @@
         <w:t xml:space="preserve">, a loop left only by a reset.</w:t>
       </w:r>
     </w:p>
-    <w:bookmarkEnd w:id="38"/>
-    <w:bookmarkStart w:id="52" w:name="functional-behaviour"/>
+    <w:bookmarkEnd w:id="33"/>
+    <w:bookmarkStart w:id="47" w:name="functional-behaviour"/>
     <w:p>
       <w:pPr>
         <w:pStyle w:val="Heading1"/>
@@ -2935,7 +3138,7 @@
         <w:t xml:space="preserve">7. Functional behaviour</w:t>
       </w:r>
     </w:p>
-    <w:bookmarkStart w:id="42" w:name="read"/>
+    <w:bookmarkStart w:id="37" w:name="read"/>
     <w:p>
       <w:pPr>
         <w:pStyle w:val="Heading2"/>
@@ -2954,18 +3157,18 @@
           <wp:inline>
             <wp:extent cx="4206240" cy="2954149"/>
             <wp:effectExtent b="0" l="0" r="0" t="0"/>
-            <wp:docPr descr="Single-beat read at the AXI port" title="" id="40" name="Picture"/>
+            <wp:docPr descr="Single-beat read at the AXI port" title="" id="35" name="Picture"/>
             <a:graphic>
               <a:graphicData uri="http://schemas.openxmlformats.org/drawingml/2006/picture">
                 <pic:pic>
                   <pic:nvPicPr>
-                    <pic:cNvPr descr="../figures/img/wave_rom_read.png" id="41" name="Picture"/>
+                    <pic:cNvPr descr="../figures/img/wave_rom_read.png" id="36" name="Picture"/>
                     <pic:cNvPicPr>
                       <a:picLocks noChangeArrowheads="1" noChangeAspect="1"/>
                     </pic:cNvPicPr>
                   </pic:nvPicPr>
                   <pic:blipFill>
-                    <a:blip r:embed="rId39"/>
+                    <a:blip r:embed="rId34"/>
                     <a:stretch>
                       <a:fillRect/>
                     </a:stretch>
@@ -3003,11 +3206,11 @@
     </w:p>
     <w:p>
       <w:pPr>
-        <w:pStyle w:val="Compact"/>
         <w:numPr>
           <w:ilvl w:val="0"/>
           <w:numId w:val="1002"/>
         </w:numPr>
+        <w:pStyle w:val="Compact"/>
         <w:jc w:val="left"/>
       </w:pPr>
       <w:r>
@@ -3058,11 +3261,11 @@
     </w:p>
     <w:p>
       <w:pPr>
-        <w:pStyle w:val="Compact"/>
         <w:numPr>
           <w:ilvl w:val="0"/>
           <w:numId w:val="1002"/>
         </w:numPr>
+        <w:pStyle w:val="Compact"/>
         <w:jc w:val="left"/>
       </w:pPr>
       <w:r>
@@ -3086,11 +3289,11 @@
     </w:p>
     <w:p>
       <w:pPr>
-        <w:pStyle w:val="Compact"/>
         <w:numPr>
           <w:ilvl w:val="0"/>
           <w:numId w:val="1002"/>
         </w:numPr>
+        <w:pStyle w:val="Compact"/>
         <w:jc w:val="left"/>
       </w:pPr>
       <w:r>
@@ -3148,8 +3351,8 @@
         <w:t xml:space="preserve">continues from word 0.</w:t>
       </w:r>
     </w:p>
-    <w:bookmarkEnd w:id="42"/>
-    <w:bookmarkStart w:id="46" w:name="image"/>
+    <w:bookmarkEnd w:id="37"/>
+    <w:bookmarkStart w:id="41" w:name="image"/>
     <w:p>
       <w:pPr>
         <w:pStyle w:val="Heading2"/>
@@ -3168,18 +3371,18 @@
           <wp:inline>
             <wp:extent cx="2743200" cy="1613647"/>
             <wp:effectExtent b="0" l="0" r="0" t="0"/>
-            <wp:docPr descr="Image port" title="" id="44" name="Picture"/>
+            <wp:docPr descr="Image port" title="" id="39" name="Picture"/>
             <a:graphic>
               <a:graphicData uri="http://schemas.openxmlformats.org/drawingml/2006/picture">
                 <pic:pic>
                   <pic:nvPicPr>
-                    <pic:cNvPr descr="../figures/img/wave_rom_image.png" id="45" name="Picture"/>
+                    <pic:cNvPr descr="../figures/img/wave_rom_image.png" id="40" name="Picture"/>
                     <pic:cNvPicPr>
                       <a:picLocks noChangeArrowheads="1" noChangeAspect="1"/>
                     </pic:cNvPicPr>
                   </pic:nvPicPr>
                   <pic:blipFill>
-                    <a:blip r:embed="rId43"/>
+                    <a:blip r:embed="rId38"/>
                     <a:stretch>
                       <a:fillRect/>
                     </a:stretch>
@@ -3217,11 +3420,11 @@
     </w:p>
     <w:p>
       <w:pPr>
-        <w:pStyle w:val="Compact"/>
         <w:numPr>
           <w:ilvl w:val="0"/>
           <w:numId w:val="1003"/>
         </w:numPr>
+        <w:pStyle w:val="Compact"/>
         <w:jc w:val="left"/>
       </w:pPr>
       <w:r>
@@ -3314,11 +3517,11 @@
     </w:p>
     <w:p>
       <w:pPr>
-        <w:pStyle w:val="Compact"/>
         <w:numPr>
           <w:ilvl w:val="0"/>
           <w:numId w:val="1003"/>
         </w:numPr>
+        <w:pStyle w:val="Compact"/>
         <w:jc w:val="left"/>
       </w:pPr>
       <w:r>
@@ -3338,8 +3541,8 @@
       </w:r>
       <w:r>
         <w:rPr>
+          <w:iCs/>
           <w:i/>
-          <w:iCs/>
         </w:rPr>
         <w:t xml:space="preserve">n</w:t>
       </w:r>
@@ -3351,8 +3554,8 @@
       </w:r>
       <w:r>
         <w:rPr>
+          <w:iCs/>
           <w:i/>
-          <w:iCs/>
         </w:rPr>
         <w:t xml:space="preserve">n</w:t>
       </w:r>
@@ -3364,8 +3567,8 @@
       </w:r>
       <w:r>
         <w:rPr>
+          <w:iCs/>
           <w:i/>
-          <w:iCs/>
         </w:rPr>
         <w:t xml:space="preserve">n</w:t>
       </w:r>
@@ -3380,8 +3583,8 @@
       </w:r>
       <w:r>
         <w:rPr>
+          <w:iCs/>
           <w:i/>
-          <w:iCs/>
         </w:rPr>
         <w:t xml:space="preserve">n</w:t>
       </w:r>
@@ -3394,11 +3597,11 @@
     </w:p>
     <w:p>
       <w:pPr>
-        <w:pStyle w:val="Compact"/>
         <w:numPr>
           <w:ilvl w:val="0"/>
           <w:numId w:val="1003"/>
         </w:numPr>
+        <w:pStyle w:val="Compact"/>
         <w:jc w:val="left"/>
       </w:pPr>
       <w:r>
@@ -3411,8 +3614,8 @@
         <w:t xml:space="preserve">from the committed hex and fails on a difference.</w:t>
       </w:r>
     </w:p>
-    <w:bookmarkEnd w:id="46"/>
-    <w:bookmarkStart w:id="50" w:name="write-error-responder"/>
+    <w:bookmarkEnd w:id="41"/>
+    <w:bookmarkStart w:id="45" w:name="write-error-responder"/>
     <w:p>
       <w:pPr>
         <w:pStyle w:val="Heading2"/>
@@ -3431,18 +3634,18 @@
           <wp:inline>
             <wp:extent cx="4023360" cy="3037636"/>
             <wp:effectExtent b="0" l="0" r="0" t="0"/>
-            <wp:docPr descr="A single-beat write answered with SLVERR" title="" id="48" name="Picture"/>
+            <wp:docPr descr="A single-beat write answered with SLVERR" title="" id="43" name="Picture"/>
             <a:graphic>
               <a:graphicData uri="http://schemas.openxmlformats.org/drawingml/2006/picture">
                 <pic:pic>
                   <pic:nvPicPr>
-                    <pic:cNvPr descr="../figures/img/wave_rom_write.png" id="49" name="Picture"/>
+                    <pic:cNvPr descr="../figures/img/wave_rom_write.png" id="44" name="Picture"/>
                     <pic:cNvPicPr>
                       <a:picLocks noChangeArrowheads="1" noChangeAspect="1"/>
                     </pic:cNvPicPr>
                   </pic:nvPicPr>
                   <pic:blipFill>
-                    <a:blip r:embed="rId47"/>
+                    <a:blip r:embed="rId42"/>
                     <a:stretch>
                       <a:fillRect/>
                     </a:stretch>
@@ -3491,20 +3694,35 @@
       <w:r>
         <w:t xml:space="preserve">write to the ROM must still be answered, or its master waits forever.</w:t>
       </w:r>
+      <w:r>
+        <w:t xml:space="preserve"> </w:t>
+      </w:r>
+      <w:r>
+        <w:rPr>
+          <w:rStyle w:val="VerbatimChar"/>
+        </w:rPr>
+        <w:t xml:space="preserve">m_qnsc_rom_wr_resp</w:t>
+      </w:r>
+      <w:r>
+        <w:t xml:space="preserve"> </w:t>
+      </w:r>
+      <w:r>
+        <w:t xml:space="preserve">does it:</w:t>
+      </w:r>
     </w:p>
     <w:p>
       <w:pPr>
-        <w:pStyle w:val="Compact"/>
         <w:numPr>
           <w:ilvl w:val="0"/>
           <w:numId w:val="1004"/>
         </w:numPr>
+        <w:pStyle w:val="Compact"/>
         <w:jc w:val="left"/>
       </w:pPr>
       <w:r>
         <w:rPr>
+          <w:bCs/>
           <w:b/>
-          <w:bCs/>
         </w:rPr>
         <w:t xml:space="preserve">IDLE</w:t>
       </w:r>
@@ -3541,17 +3759,17 @@
     </w:p>
     <w:p>
       <w:pPr>
-        <w:pStyle w:val="Compact"/>
         <w:numPr>
           <w:ilvl w:val="0"/>
           <w:numId w:val="1004"/>
         </w:numPr>
+        <w:pStyle w:val="Compact"/>
         <w:jc w:val="left"/>
       </w:pPr>
       <w:r>
         <w:rPr>
+          <w:bCs/>
           <w:b/>
-          <w:bCs/>
         </w:rPr>
         <w:t xml:space="preserve">DATA</w:t>
       </w:r>
@@ -3588,17 +3806,17 @@
     </w:p>
     <w:p>
       <w:pPr>
-        <w:pStyle w:val="Compact"/>
         <w:numPr>
           <w:ilvl w:val="0"/>
           <w:numId w:val="1004"/>
         </w:numPr>
+        <w:pStyle w:val="Compact"/>
         <w:jc w:val="left"/>
       </w:pPr>
       <w:r>
         <w:rPr>
+          <w:bCs/>
           <w:b/>
-          <w:bCs/>
         </w:rPr>
         <w:t xml:space="preserve">RESP</w:t>
       </w:r>
@@ -3692,8 +3910,8 @@
         <w:t xml:space="preserve">or DMA.</w:t>
       </w:r>
     </w:p>
-    <w:bookmarkEnd w:id="50"/>
-    <w:bookmarkStart w:id="51" w:name="reset"/>
+    <w:bookmarkEnd w:id="45"/>
+    <w:bookmarkStart w:id="46" w:name="reset"/>
     <w:p>
       <w:pPr>
         <w:pStyle w:val="Heading2"/>
@@ -3770,9 +3988,9 @@
         <w:t xml:space="preserve">so no access reaches it in reset. The responder resets to IDLE.</w:t>
       </w:r>
     </w:p>
-    <w:bookmarkEnd w:id="51"/>
-    <w:bookmarkEnd w:id="52"/>
-    <w:bookmarkStart w:id="53" w:name="instances"/>
+    <w:bookmarkEnd w:id="46"/>
+    <w:bookmarkEnd w:id="47"/>
+    <w:bookmarkStart w:id="48" w:name="instances"/>
     <w:p>
       <w:pPr>
         <w:pStyle w:val="Heading1"/>
@@ -3816,8 +4034,8 @@
         <w:t xml:space="preserve">.</w:t>
       </w:r>
     </w:p>
-    <w:bookmarkEnd w:id="53"/>
-    <w:bookmarkStart w:id="54" w:name="X31074a9102d88bba972e4f71edc3e97f3cd819b"/>
+    <w:bookmarkEnd w:id="48"/>
+    <w:bookmarkStart w:id="49" w:name="X31074a9102d88bba972e4f71edc3e97f3cd819b"/>
     <w:p>
       <w:pPr>
         <w:pStyle w:val="Heading1"/>
@@ -3838,8 +4056,8 @@
       <w:tblPr>
         <w:tblStyle w:val="TableGrid"/>
         <w:tblW w:type="pct" w:w="5000"/>
-        <w:tblLayout w:type="fixed"/>
         <w:tblLook w:firstRow="1" w:lastRow="0" w:firstColumn="0" w:lastColumn="0" w:noHBand="0" w:noVBand="0" w:val="0020"/>
+        <w:jc w:val="start"/>
         <w:tblCaption w:val="Functions this block does not provide"/>
       </w:tblPr>
       <w:tblGrid>
@@ -3848,7 +4066,7 @@
       </w:tblGrid>
       <w:tr>
         <w:trPr>
-          <w:tblHeader w:val="on"/>
+          <w:tblHeader w:val="true"/>
         </w:trPr>
         <w:tc>
           <w:tcPr/>
@@ -4040,8 +4258,8 @@
         </w:tc>
       </w:tr>
     </w:tbl>
-    <w:bookmarkEnd w:id="54"/>
-    <w:bookmarkStart w:id="55" w:name="tie-offs"/>
+    <w:bookmarkEnd w:id="49"/>
+    <w:bookmarkStart w:id="50" w:name="tie-offs"/>
     <w:p>
       <w:pPr>
         <w:pStyle w:val="Heading1"/>
@@ -4071,8 +4289,8 @@
       <w:tblPr>
         <w:tblStyle w:val="TableGrid"/>
         <w:tblW w:type="pct" w:w="5000"/>
-        <w:tblLayout w:type="fixed"/>
         <w:tblLook w:firstRow="1" w:lastRow="0" w:firstColumn="0" w:lastColumn="0" w:noHBand="0" w:noVBand="0" w:val="0020"/>
+        <w:jc w:val="start"/>
         <w:tblCaption w:val="Controller ports tied inside m_qnsc_wrap_rom"/>
       </w:tblPr>
       <w:tblGrid>
@@ -4082,7 +4300,7 @@
       </w:tblGrid>
       <w:tr>
         <w:trPr>
-          <w:tblHeader w:val="on"/>
+          <w:tblHeader w:val="true"/>
         </w:trPr>
         <w:tc>
           <w:tcPr/>
@@ -4430,8 +4648,8 @@
         </w:tc>
       </w:tr>
     </w:tbl>
-    <w:bookmarkEnd w:id="55"/>
-    <w:bookmarkStart w:id="56" w:name="requirements-on-others-and-open-items"/>
+    <w:bookmarkEnd w:id="50"/>
+    <w:bookmarkStart w:id="51" w:name="requirements-on-others-and-open-items"/>
     <w:p>
       <w:pPr>
         <w:pStyle w:val="Heading1"/>
@@ -4452,8 +4670,8 @@
       <w:tblPr>
         <w:tblStyle w:val="TableGrid"/>
         <w:tblW w:type="pct" w:w="5000"/>
-        <w:tblLayout w:type="fixed"/>
         <w:tblLook w:firstRow="1" w:lastRow="0" w:firstColumn="0" w:lastColumn="0" w:noHBand="0" w:noVBand="0" w:val="0020"/>
+        <w:jc w:val="start"/>
         <w:tblCaption w:val="Requirements on other owners"/>
       </w:tblPr>
       <w:tblGrid>
@@ -4463,7 +4681,7 @@
       </w:tblGrid>
       <w:tr>
         <w:trPr>
-          <w:tblHeader w:val="on"/>
+          <w:tblHeader w:val="true"/>
         </w:trPr>
         <w:tc>
           <w:tcPr/>
@@ -4646,8 +4864,8 @@
       <w:tblPr>
         <w:tblStyle w:val="TableGrid"/>
         <w:tblW w:type="pct" w:w="5000"/>
-        <w:tblLayout w:type="fixed"/>
         <w:tblLook w:firstRow="1" w:lastRow="0" w:firstColumn="0" w:lastColumn="0" w:noHBand="0" w:noVBand="0" w:val="0020"/>
+        <w:jc w:val="start"/>
         <w:tblCaption w:val="HAS text this specification departs from"/>
       </w:tblPr>
       <w:tblGrid>
@@ -4657,7 +4875,7 @@
       </w:tblGrid>
       <w:tr>
         <w:trPr>
-          <w:tblHeader w:val="on"/>
+          <w:tblHeader w:val="true"/>
         </w:trPr>
         <w:tc>
           <w:tcPr/>
@@ -4835,8 +5053,8 @@
         <w:t xml:space="preserve">and a correctly programmed DMA never issue one.</w:t>
       </w:r>
     </w:p>
-    <w:bookmarkEnd w:id="56"/>
-    <w:bookmarkStart w:id="57" w:name="verification"/>
+    <w:bookmarkEnd w:id="51"/>
+    <w:bookmarkStart w:id="52" w:name="verification"/>
     <w:p>
       <w:pPr>
         <w:pStyle w:val="Heading1"/>
@@ -4847,11 +5065,11 @@
     </w:p>
     <w:p>
       <w:pPr>
-        <w:pStyle w:val="Compact"/>
         <w:numPr>
           <w:ilvl w:val="0"/>
           <w:numId w:val="1005"/>
         </w:numPr>
+        <w:pStyle w:val="Compact"/>
         <w:jc w:val="left"/>
       </w:pPr>
       <w:r>
@@ -4881,11 +5099,11 @@
     </w:p>
     <w:p>
       <w:pPr>
-        <w:pStyle w:val="Compact"/>
         <w:numPr>
           <w:ilvl w:val="0"/>
           <w:numId w:val="1005"/>
         </w:numPr>
+        <w:pStyle w:val="Compact"/>
         <w:jc w:val="left"/>
       </w:pPr>
       <w:r>
@@ -4933,11 +5151,11 @@
     </w:p>
     <w:p>
       <w:pPr>
-        <w:pStyle w:val="Compact"/>
         <w:numPr>
           <w:ilvl w:val="0"/>
           <w:numId w:val="1005"/>
         </w:numPr>
+        <w:pStyle w:val="Compact"/>
         <w:jc w:val="left"/>
       </w:pPr>
       <w:r>
@@ -4988,11 +5206,11 @@
     </w:p>
     <w:p>
       <w:pPr>
-        <w:pStyle w:val="Compact"/>
         <w:numPr>
           <w:ilvl w:val="0"/>
           <w:numId w:val="1005"/>
         </w:numPr>
+        <w:pStyle w:val="Compact"/>
         <w:jc w:val="left"/>
       </w:pPr>
       <w:r>
@@ -5052,11 +5270,11 @@
     </w:p>
     <w:p>
       <w:pPr>
-        <w:pStyle w:val="Compact"/>
         <w:numPr>
           <w:ilvl w:val="0"/>
           <w:numId w:val="1005"/>
         </w:numPr>
+        <w:pStyle w:val="Compact"/>
         <w:jc w:val="left"/>
       </w:pPr>
       <w:r>
@@ -5074,11 +5292,11 @@
     </w:p>
     <w:p>
       <w:pPr>
-        <w:pStyle w:val="Compact"/>
         <w:numPr>
           <w:ilvl w:val="0"/>
           <w:numId w:val="1005"/>
         </w:numPr>
+        <w:pStyle w:val="Compact"/>
         <w:jc w:val="left"/>
       </w:pPr>
       <w:r>
@@ -5126,11 +5344,11 @@
     </w:p>
     <w:p>
       <w:pPr>
-        <w:pStyle w:val="Compact"/>
         <w:numPr>
           <w:ilvl w:val="0"/>
           <w:numId w:val="1005"/>
         </w:numPr>
+        <w:pStyle w:val="Compact"/>
         <w:jc w:val="left"/>
       </w:pPr>
       <w:r>
@@ -5178,11 +5396,11 @@
     </w:p>
     <w:p>
       <w:pPr>
-        <w:pStyle w:val="Compact"/>
         <w:numPr>
           <w:ilvl w:val="0"/>
           <w:numId w:val="1005"/>
         </w:numPr>
+        <w:pStyle w:val="Compact"/>
         <w:jc w:val="left"/>
       </w:pPr>
       <w:r>
@@ -5228,8 +5446,8 @@
         <w:t xml:space="preserve">reports no memory and no latch.</w:t>
       </w:r>
     </w:p>
-    <w:bookmarkEnd w:id="57"/>
-    <w:bookmarkStart w:id="58" w:name="appendix-a.-acronyms"/>
+    <w:bookmarkEnd w:id="52"/>
+    <w:bookmarkStart w:id="53" w:name="appendix-a.-acronyms"/>
     <w:p>
       <w:pPr>
         <w:pStyle w:val="Heading1"/>
@@ -5251,6 +5469,7 @@
         <w:tblStyle w:val="TableGrid"/>
         <w:tblW w:type="auto" w:w="0"/>
         <w:tblLook w:firstRow="1" w:lastRow="0" w:firstColumn="0" w:lastColumn="0" w:noHBand="0" w:noVBand="0" w:val="0020"/>
+        <w:jc w:val="start"/>
         <w:tblCaption w:val="Acronyms"/>
       </w:tblPr>
       <w:tblGrid>
@@ -5259,7 +5478,7 @@
       </w:tblGrid>
       <w:tr>
         <w:trPr>
-          <w:tblHeader w:val="on"/>
+          <w:tblHeader w:val="true"/>
         </w:trPr>
         <w:tc>
           <w:tcPr/>
@@ -5374,8 +5593,8 @@
         </w:tc>
       </w:tr>
     </w:tbl>
-    <w:bookmarkEnd w:id="58"/>
-    <w:bookmarkStart w:id="59" w:name="appendix-b.-first-review"/>
+    <w:bookmarkEnd w:id="53"/>
+    <w:bookmarkStart w:id="54" w:name="appendix-b.-first-review"/>
     <w:p>
       <w:pPr>
         <w:pStyle w:val="Heading1"/>
@@ -5396,8 +5615,8 @@
       <w:tblPr>
         <w:tblStyle w:val="TableGrid"/>
         <w:tblW w:type="pct" w:w="5000"/>
-        <w:tblLayout w:type="fixed"/>
         <w:tblLook w:firstRow="1" w:lastRow="0" w:firstColumn="0" w:lastColumn="0" w:noHBand="0" w:noVBand="0" w:val="0020"/>
+        <w:jc w:val="start"/>
         <w:tblCaption w:val="First review"/>
       </w:tblPr>
       <w:tblGrid>
@@ -5407,7 +5626,7 @@
       </w:tblGrid>
       <w:tr>
         <w:trPr>
-          <w:tblHeader w:val="on"/>
+          <w:tblHeader w:val="true"/>
         </w:trPr>
         <w:tc>
           <w:tcPr/>
@@ -5973,12 +6192,12 @@
         </w:tc>
       </w:tr>
     </w:tbl>
-    <w:bookmarkEnd w:id="59"/>
+    <w:bookmarkEnd w:id="54"/>
     <w:sectPr>
-      <w:headerReference r:id="rId11" w:type="default"/>
-      <w:footerReference r:id="rId12" w:type="even"/>
-      <w:footerReference r:id="rId13" w:type="default"/>
-      <w:footerReference r:id="rId14" w:type="first"/>
+      <w:headerReference r:id="rId9" w:type="default"/>
+      <w:footerReference r:id="rId11" w:type="even"/>
+      <w:footerReference r:id="rId10" w:type="default"/>
+      <w:footerReference r:id="rId13" w:type="first"/>
       <w:pgSz w:code="9" w:h="16838" w:w="11906"/>
       <w:pgMar w:bottom="1440" w:footer="288" w:gutter="0" w:header="432" w:left="1440" w:right="1440" w:top="1440"/>
       <w:pgNumType w:fmt="lowerRoman" w:start="1"/>
@@ -6212,7 +6431,7 @@
       <w:rPr>
         <w:szCs w:val="26"/>
       </w:rPr>
-      <w:t>V3.1</w:t>
+      <w:t>V3.2</w:t>
     </w:r>
     <w:r>
       <w:rPr>
@@ -7786,14 +8005,14 @@
     </w:lvl>
   </w:abstractNum>
   <w:abstractNum w:abstractNumId="990">
-    <w:nsid w:val="0000A990"/>
+    <w:nsid w:val="A990"/>
     <w:multiLevelType w:val="multilevel"/>
     <w:lvl w:ilvl="0">
       <w:numFmt w:val="bullet"/>
       <w:lvlText w:val=" "/>
       <w:lvlJc w:val="left"/>
       <w:pPr>
-        <w:ind w:left="720" w:hanging="360"/>
+        <w:ind w:left="720" w:hanging="480"/>
       </w:pPr>
     </w:lvl>
     <w:lvl w:ilvl="1">
@@ -7801,7 +8020,7 @@
       <w:lvlText w:val=" "/>
       <w:lvlJc w:val="left"/>
       <w:pPr>
-        <w:ind w:left="1440" w:hanging="360"/>
+        <w:ind w:left="1440" w:hanging="480"/>
       </w:pPr>
     </w:lvl>
     <w:lvl w:ilvl="2">
@@ -7809,7 +8028,7 @@
       <w:lvlText w:val=" "/>
       <w:lvlJc w:val="left"/>
       <w:pPr>
-        <w:ind w:left="2160" w:hanging="360"/>
+        <w:ind w:left="2160" w:hanging="480"/>
       </w:pPr>
     </w:lvl>
     <w:lvl w:ilvl="3">
@@ -7817,7 +8036,7 @@
       <w:lvlText w:val=" "/>
       <w:lvlJc w:val="left"/>
       <w:pPr>
-        <w:ind w:left="2880" w:hanging="360"/>
+        <w:ind w:left="2880" w:hanging="480"/>
       </w:pPr>
     </w:lvl>
     <w:lvl w:ilvl="4">
@@ -7825,7 +8044,7 @@
       <w:lvlText w:val=" "/>
       <w:lvlJc w:val="left"/>
       <w:pPr>
-        <w:ind w:left="3600" w:hanging="360"/>
+        <w:ind w:left="3600" w:hanging="480"/>
       </w:pPr>
     </w:lvl>
     <w:lvl w:ilvl="5">
@@ -7833,7 +8052,7 @@
       <w:lvlText w:val=" "/>
       <w:lvlJc w:val="left"/>
       <w:pPr>
-        <w:ind w:left="4320" w:hanging="360"/>
+        <w:ind w:left="4320" w:hanging="480"/>
       </w:pPr>
     </w:lvl>
     <w:lvl w:ilvl="6">
@@ -7841,7 +8060,7 @@
       <w:lvlText w:val=" "/>
       <w:lvlJc w:val="left"/>
       <w:pPr>
-        <w:ind w:left="5040" w:hanging="360"/>
+        <w:ind w:left="5040" w:hanging="480"/>
       </w:pPr>
     </w:lvl>
     <w:lvl w:ilvl="7">
@@ -7849,7 +8068,7 @@
       <w:lvlText w:val=" "/>
       <w:lvlJc w:val="left"/>
       <w:pPr>
-        <w:ind w:left="5760" w:hanging="360"/>
+        <w:ind w:left="5760" w:hanging="480"/>
       </w:pPr>
     </w:lvl>
     <w:lvl w:ilvl="8">
@@ -7857,115 +8076,88 @@
       <w:lvlText w:val=" "/>
       <w:lvlJc w:val="left"/>
       <w:pPr>
-        <w:ind w:left="6480" w:hanging="360"/>
+        <w:ind w:left="6480" w:hanging="480"/>
       </w:pPr>
     </w:lvl>
   </w:abstractNum>
   <w:abstractNum w:abstractNumId="991">
-    <w:nsid w:val="0000A991"/>
+    <w:nsid w:val="A991"/>
     <w:multiLevelType w:val="multilevel"/>
     <w:lvl w:ilvl="0">
       <w:numFmt w:val="bullet"/>
-      <w:lvlText w:val=""/>
-      <w:lvlJc w:val="left"/>
-      <w:pPr>
-        <w:ind w:left="720" w:hanging="360"/>
-      </w:pPr>
-      <w:rPr>
-        <w:rFonts w:ascii="Symbol" w:hAnsi="Symbol" w:cs="Symbol" w:hint="default"/>
-      </w:rPr>
+      <w:lvlText w:val="•"/>
+      <w:lvlJc w:val="left"/>
+      <w:pPr>
+        <w:ind w:left="720" w:hanging="480"/>
+      </w:pPr>
     </w:lvl>
     <w:lvl w:ilvl="1">
       <w:numFmt w:val="bullet"/>
-      <w:lvlText w:val="o"/>
-      <w:lvlJc w:val="left"/>
-      <w:pPr>
-        <w:ind w:left="1440" w:hanging="360"/>
-      </w:pPr>
-      <w:rPr>
-        <w:rFonts w:ascii="Courier New" w:hAnsi="Courier New" w:cs="Courier New" w:hint="default"/>
-      </w:rPr>
+      <w:lvlText w:val="–"/>
+      <w:lvlJc w:val="left"/>
+      <w:pPr>
+        <w:ind w:left="1440" w:hanging="480"/>
+      </w:pPr>
     </w:lvl>
     <w:lvl w:ilvl="2">
       <w:numFmt w:val="bullet"/>
-      <w:lvlText w:val=""/>
-      <w:lvlJc w:val="left"/>
-      <w:pPr>
-        <w:ind w:left="2160" w:hanging="360"/>
-      </w:pPr>
-      <w:rPr>
-        <w:rFonts w:ascii="Wingdings" w:hAnsi="Wingdings" w:cs="Wingdings" w:hint="default"/>
-      </w:rPr>
+      <w:lvlText w:val="•"/>
+      <w:lvlJc w:val="left"/>
+      <w:pPr>
+        <w:ind w:left="2160" w:hanging="480"/>
+      </w:pPr>
     </w:lvl>
     <w:lvl w:ilvl="3">
       <w:numFmt w:val="bullet"/>
-      <w:lvlText w:val=""/>
-      <w:lvlJc w:val="left"/>
-      <w:pPr>
-        <w:ind w:left="2880" w:hanging="360"/>
-      </w:pPr>
-      <w:rPr>
-        <w:rFonts w:ascii="Symbol" w:hAnsi="Symbol" w:cs="Symbol" w:hint="default"/>
-      </w:rPr>
+      <w:lvlText w:val="–"/>
+      <w:lvlJc w:val="left"/>
+      <w:pPr>
+        <w:ind w:left="2880" w:hanging="480"/>
+      </w:pPr>
     </w:lvl>
     <w:lvl w:ilvl="4">
       <w:numFmt w:val="bullet"/>
-      <w:lvlText w:val="o"/>
-      <w:lvlJc w:val="left"/>
-      <w:pPr>
-        <w:ind w:left="3600" w:hanging="360"/>
-      </w:pPr>
-      <w:rPr>
-        <w:rFonts w:ascii="Courier New" w:hAnsi="Courier New" w:cs="Courier New" w:hint="default"/>
-      </w:rPr>
+      <w:lvlText w:val="•"/>
+      <w:lvlJc w:val="left"/>
+      <w:pPr>
+        <w:ind w:left="3600" w:hanging="480"/>
+      </w:pPr>
     </w:lvl>
     <w:lvl w:ilvl="5">
       <w:numFmt w:val="bullet"/>
-      <w:lvlText w:val=""/>
-      <w:lvlJc w:val="left"/>
-      <w:pPr>
-        <w:ind w:left="4320" w:hanging="360"/>
-      </w:pPr>
-      <w:rPr>
-        <w:rFonts w:ascii="Wingdings" w:hAnsi="Wingdings" w:cs="Wingdings" w:hint="default"/>
-      </w:rPr>
+      <w:lvlText w:val="–"/>
+      <w:lvlJc w:val="left"/>
+      <w:pPr>
+        <w:ind w:left="4320" w:hanging="480"/>
+      </w:pPr>
     </w:lvl>
     <w:lvl w:ilvl="6">
       <w:numFmt w:val="bullet"/>
-      <w:lvlText w:val=""/>
-      <w:lvlJc w:val="left"/>
-      <w:pPr>
-        <w:ind w:left="5040" w:hanging="360"/>
-      </w:pPr>
-      <w:rPr>
-        <w:rFonts w:ascii="Symbol" w:hAnsi="Symbol" w:cs="Symbol" w:hint="default"/>
-      </w:rPr>
+      <w:lvlText w:val="•"/>
+      <w:lvlJc w:val="left"/>
+      <w:pPr>
+        <w:ind w:left="5040" w:hanging="480"/>
+      </w:pPr>
     </w:lvl>
     <w:lvl w:ilvl="7">
       <w:numFmt w:val="bullet"/>
-      <w:lvlText w:val="o"/>
-      <w:lvlJc w:val="left"/>
-      <w:pPr>
-        <w:ind w:left="5760" w:hanging="360"/>
-      </w:pPr>
-      <w:rPr>
-        <w:rFonts w:ascii="Courier New" w:hAnsi="Courier New" w:cs="Courier New" w:hint="default"/>
-      </w:rPr>
+      <w:lvlText w:val="–"/>
+      <w:lvlJc w:val="left"/>
+      <w:pPr>
+        <w:ind w:left="5760" w:hanging="480"/>
+      </w:pPr>
     </w:lvl>
     <w:lvl w:ilvl="8">
       <w:numFmt w:val="bullet"/>
-      <w:lvlText w:val=""/>
-      <w:lvlJc w:val="left"/>
-      <w:pPr>
-        <w:ind w:left="6480" w:hanging="360"/>
-      </w:pPr>
-      <w:rPr>
-        <w:rFonts w:ascii="Wingdings" w:hAnsi="Wingdings" w:cs="Wingdings" w:hint="default"/>
-      </w:rPr>
+      <w:lvlText w:val="•"/>
+      <w:lvlJc w:val="left"/>
+      <w:pPr>
+        <w:ind w:left="6480" w:hanging="480"/>
+      </w:pPr>
     </w:lvl>
   </w:abstractNum>
   <w:abstractNum w:abstractNumId="99411">
-    <w:nsid w:val="00A99411"/>
+    <w:nsid w:val="A99411"/>
     <w:multiLevelType w:val="multilevel"/>
     <w:lvl w:ilvl="0">
       <w:start w:val="1"/>
@@ -7973,7 +8165,7 @@
       <w:lvlText w:val="%1."/>
       <w:lvlJc w:val="left"/>
       <w:pPr>
-        <w:ind w:left="720" w:hanging="360"/>
+        <w:ind w:left="720" w:hanging="480"/>
       </w:pPr>
     </w:lvl>
     <w:lvl w:ilvl="1">
@@ -7982,7 +8174,7 @@
       <w:lvlText w:val="%2."/>
       <w:lvlJc w:val="left"/>
       <w:pPr>
-        <w:ind w:left="1440" w:hanging="360"/>
+        <w:ind w:left="1440" w:hanging="480"/>
       </w:pPr>
     </w:lvl>
     <w:lvl w:ilvl="2">
@@ -7991,7 +8183,7 @@
       <w:lvlText w:val="%3."/>
       <w:lvlJc w:val="left"/>
       <w:pPr>
-        <w:ind w:left="2160" w:hanging="360"/>
+        <w:ind w:left="2160" w:hanging="480"/>
       </w:pPr>
     </w:lvl>
     <w:lvl w:ilvl="3">
@@ -8000,7 +8192,7 @@
       <w:lvlText w:val="%4."/>
       <w:lvlJc w:val="left"/>
       <w:pPr>
-        <w:ind w:left="2880" w:hanging="360"/>
+        <w:ind w:left="2880" w:hanging="480"/>
       </w:pPr>
     </w:lvl>
     <w:lvl w:ilvl="4">
@@ -8009,7 +8201,7 @@
       <w:lvlText w:val="%5."/>
       <w:lvlJc w:val="left"/>
       <w:pPr>
-        <w:ind w:left="3600" w:hanging="360"/>
+        <w:ind w:left="3600" w:hanging="480"/>
       </w:pPr>
     </w:lvl>
     <w:lvl w:ilvl="5">
@@ -8018,7 +8210,7 @@
       <w:lvlText w:val="%6."/>
       <w:lvlJc w:val="left"/>
       <w:pPr>
-        <w:ind w:left="4320" w:hanging="360"/>
+        <w:ind w:left="4320" w:hanging="480"/>
       </w:pPr>
     </w:lvl>
     <w:lvl w:ilvl="6">
@@ -8027,7 +8219,7 @@
       <w:lvlText w:val="%7."/>
       <w:lvlJc w:val="left"/>
       <w:pPr>
-        <w:ind w:left="5040" w:hanging="360"/>
+        <w:ind w:left="5040" w:hanging="480"/>
       </w:pPr>
     </w:lvl>
     <w:lvl w:ilvl="7">
@@ -8036,7 +8228,7 @@
       <w:lvlText w:val="%8."/>
       <w:lvlJc w:val="left"/>
       <w:pPr>
-        <w:ind w:left="5760" w:hanging="360"/>
+        <w:ind w:left="5760" w:hanging="480"/>
       </w:pPr>
     </w:lvl>
     <w:lvl w:ilvl="8">
@@ -8045,7 +8237,7 @@
       <w:lvlText w:val="%9."/>
       <w:lvlJc w:val="left"/>
       <w:pPr>
-        <w:ind w:left="6480" w:hanging="360"/>
+        <w:ind w:left="6480" w:hanging="480"/>
       </w:pPr>
     </w:lvl>
   </w:abstractNum>
@@ -10635,8 +10827,8 @@
     <w:name w:val="KeywordTok"/>
     <w:basedOn w:val="VerbatimChar"/>
     <w:rPr>
+      <w:color w:val="007020"/>
       <w:b/>
-      <w:color w:val="007020"/>
     </w:rPr>
   </w:style>
   <w:style w:type="character" w:customStyle="1" w:styleId="DataTypeTok">
@@ -10713,42 +10905,42 @@
     <w:name w:val="ImportTok"/>
     <w:basedOn w:val="VerbatimChar"/>
     <w:rPr>
+      <w:color w:val="008000"/>
       <w:b/>
-      <w:color w:val="008000"/>
     </w:rPr>
   </w:style>
   <w:style w:type="character" w:customStyle="1" w:styleId="CommentTok">
     <w:name w:val="CommentTok"/>
     <w:basedOn w:val="VerbatimChar"/>
     <w:rPr>
+      <w:color w:val="60a0b0"/>
       <w:i/>
-      <w:color w:val="60a0b0"/>
     </w:rPr>
   </w:style>
   <w:style w:type="character" w:customStyle="1" w:styleId="DocumentationTok">
     <w:name w:val="DocumentationTok"/>
     <w:basedOn w:val="VerbatimChar"/>
     <w:rPr>
+      <w:color w:val="ba2121"/>
       <w:i/>
-      <w:color w:val="ba2121"/>
     </w:rPr>
   </w:style>
   <w:style w:type="character" w:customStyle="1" w:styleId="AnnotationTok">
     <w:name w:val="AnnotationTok"/>
     <w:basedOn w:val="VerbatimChar"/>
     <w:rPr>
+      <w:color w:val="60a0b0"/>
       <w:b/>
       <w:i/>
-      <w:color w:val="60a0b0"/>
     </w:rPr>
   </w:style>
   <w:style w:type="character" w:customStyle="1" w:styleId="CommentVarTok">
     <w:name w:val="CommentVarTok"/>
     <w:basedOn w:val="VerbatimChar"/>
     <w:rPr>
+      <w:color w:val="60a0b0"/>
       <w:b/>
       <w:i/>
-      <w:color w:val="60a0b0"/>
     </w:rPr>
   </w:style>
   <w:style w:type="character" w:customStyle="1" w:styleId="OtherTok">
@@ -10776,8 +10968,8 @@
     <w:name w:val="ControlFlowTok"/>
     <w:basedOn w:val="VerbatimChar"/>
     <w:rPr>
+      <w:color w:val="007020"/>
       <w:b/>
-      <w:color w:val="007020"/>
     </w:rPr>
   </w:style>
   <w:style w:type="character" w:customStyle="1" w:styleId="OperatorTok">
@@ -10822,34 +11014,34 @@
     <w:name w:val="InformationTok"/>
     <w:basedOn w:val="VerbatimChar"/>
     <w:rPr>
+      <w:color w:val="60a0b0"/>
       <w:b/>
       <w:i/>
-      <w:color w:val="60a0b0"/>
     </w:rPr>
   </w:style>
   <w:style w:type="character" w:customStyle="1" w:styleId="WarningTok">
     <w:name w:val="WarningTok"/>
     <w:basedOn w:val="VerbatimChar"/>
     <w:rPr>
+      <w:color w:val="60a0b0"/>
       <w:b/>
       <w:i/>
-      <w:color w:val="60a0b0"/>
     </w:rPr>
   </w:style>
   <w:style w:type="character" w:customStyle="1" w:styleId="AlertTok">
     <w:name w:val="AlertTok"/>
     <w:basedOn w:val="VerbatimChar"/>
     <w:rPr>
+      <w:color w:val="ff0000"/>
       <w:b/>
-      <w:color w:val="ff0000"/>
     </w:rPr>
   </w:style>
   <w:style w:type="character" w:customStyle="1" w:styleId="ErrorTok">
     <w:name w:val="ErrorTok"/>
     <w:basedOn w:val="VerbatimChar"/>
     <w:rPr>
+      <w:color w:val="ff0000"/>
       <w:b/>
-      <w:color w:val="ff0000"/>
     </w:rPr>
   </w:style>
   <w:style w:type="character" w:customStyle="1" w:styleId="NormalTok">

</xml_diff>